<commit_message>
Cập nhật tính năng đọc Powerpoint, sửa lỗi video docx và tối ưu giao diện slide
</commit_message>
<xml_diff>
--- a/data/news/05.docx
+++ b/data/news/05.docx
@@ -34,7 +34,7 @@
           <w:szCs w:val="28"/>
           <w:lang w:val="pt-BR"/>
         </w:rPr>
-        <w:t>VIDEO</w:t>
+        <w:t>nghệ thuật quần chúng</w:t>
       </w:r>
     </w:p>
     <w:p>
@@ -80,7 +80,18 @@
           <w:szCs w:val="28"/>
           <w:lang w:val="pt-BR"/>
         </w:rPr>
-        <w:t>TESTVIDEO</w:t>
+        <w:t>Tiểu yêu qu</w:t>
+      </w:r>
+      <w:r>
+        <w:rPr>
+          <w:rFonts w:ascii="Times New Roman" w:hAnsi="Times New Roman" w:cs="Times New Roman"/>
+          <w:b/>
+          <w:bCs/>
+          <w:sz w:val="28"/>
+          <w:szCs w:val="28"/>
+          <w:lang w:val="pt-BR"/>
+        </w:rPr>
+        <w:t>ái núi Lãng Lãng</w:t>
       </w:r>
     </w:p>
     <w:p>
@@ -115,18 +126,7 @@
           <w:szCs w:val="28"/>
           <w:lang w:val="pt-BR"/>
         </w:rPr>
-        <w:t>X</w:t>
-      </w:r>
-      <w:r>
-        <w:rPr>
-          <w:rFonts w:ascii="Times New Roman" w:hAnsi="Times New Roman" w:cs="Times New Roman"/>
-          <w:b/>
-          <w:bCs/>
-          <w:sz w:val="28"/>
-          <w:szCs w:val="28"/>
-          <w:lang w:val="pt-BR"/>
-        </w:rPr>
-        <w:t>ONG</w:t>
+        <w:t>XONG</w:t>
       </w:r>
     </w:p>
     <w:p>
@@ -148,6 +148,7 @@
           <w:bCs/>
           <w:sz w:val="28"/>
           <w:szCs w:val="28"/>
+          <w:lang w:val="pt-BR"/>
         </w:rPr>
         <w:t>#Ngay: 01/03/2026</w:t>
       </w:r>
@@ -196,99 +197,56 @@
           <w:bCs/>
           <w:sz w:val="28"/>
           <w:szCs w:val="28"/>
+          <w:lang w:val="pt-BR"/>
         </w:rPr>
       </w:pPr>
     </w:p>
     <w:p>
-      <w:r>
-        <w:object w:dxaOrig="1542" w:dyaOrig="995" w14:anchorId="296319AF">
-          <v:shapetype id="_x0000_t75" coordsize="21600,21600" o:spt="75" o:preferrelative="t" path="m@4@5l@4@11@9@11@9@5xe" filled="f" stroked="f">
-            <v:stroke joinstyle="miter"/>
-            <v:formulas>
-              <v:f eqn="if lineDrawn pixelLineWidth 0"/>
-              <v:f eqn="sum @0 1 0"/>
-              <v:f eqn="sum 0 0 @1"/>
-              <v:f eqn="prod @2 1 2"/>
-              <v:f eqn="prod @3 21600 pixelWidth"/>
-              <v:f eqn="prod @3 21600 pixelHeight"/>
-              <v:f eqn="sum @0 0 1"/>
-              <v:f eqn="prod @6 1 2"/>
-              <v:f eqn="prod @7 21600 pixelWidth"/>
-              <v:f eqn="sum @8 21600 0"/>
-              <v:f eqn="prod @7 21600 pixelHeight"/>
-              <v:f eqn="sum @10 21600 0"/>
-            </v:formulas>
-            <v:path o:extrusionok="f" gradientshapeok="t" o:connecttype="rect"/>
-            <o:lock v:ext="edit" aspectratio="t"/>
-          </v:shapetype>
-          <v:shape id="_x0000_i1025" type="#_x0000_t75" style="width:77.25pt;height:49.5pt" o:ole="">
-            <v:imagedata r:id="rId6" o:title=""/>
-          </v:shape>
-          <o:OLEObject Type="Embed" ProgID="Package" ShapeID="_x0000_i1025" DrawAspect="Icon" ObjectID="_1833904539" r:id="rId7"/>
-        </w:object>
+      <w:pPr>
+        <w:rPr>
+          <w:lang w:val="pt-BR"/>
+        </w:rPr>
+      </w:pPr>
+      <w:r>
+        <w:rPr>
+          <w:lang w:val="pt-BR"/>
+        </w:rPr>
+        <w:t>https://www.youtube.com/watch?v=vKdH5y7kgdI</w:t>
       </w:r>
     </w:p>
-    <w:p/>
     <w:p>
-      <w:r>
+      <w:pPr>
+        <w:rPr>
+          <w:lang w:val="pt-BR"/>
+        </w:rPr>
+      </w:pPr>
+    </w:p>
+    <w:p>
+      <w:pPr>
+        <w:rPr>
+          <w:lang w:val="pt-BR"/>
+        </w:rPr>
+      </w:pPr>
+      <w:r>
+        <w:rPr>
+          <w:lang w:val="pt-BR"/>
+        </w:rPr>
         <w:t>Không chạy được</w:t>
       </w:r>
     </w:p>
-    <w:p/>
     <w:p>
-      <w:r>
-        <w:rPr>
-          <w:noProof/>
-        </w:rPr>
-        <w:drawing>
-          <wp:inline distT="0" distB="0" distL="0" distR="0" wp14:anchorId="21A689A4" wp14:editId="3C5802D6">
-            <wp:extent cx="5886450" cy="3429000"/>
-            <wp:effectExtent l="0" t="0" r="0" b="0"/>
-            <wp:docPr id="971824174" name="Video 1" descr="Xem Như Tôi Từng Cưới Được Cô Ấy, Hôn Lễ Của Em - Nhạc Trẻ Ballad Việt 2026 Triệu View Hot TikTok">
-              <a:hlinkClick xmlns:a="http://schemas.openxmlformats.org/drawingml/2006/main" r:id="rId8"/>
-            </wp:docPr>
-            <wp:cNvGraphicFramePr>
-              <a:graphicFrameLocks xmlns:a="http://schemas.openxmlformats.org/drawingml/2006/main" noChangeAspect="1"/>
-            </wp:cNvGraphicFramePr>
-            <a:graphic xmlns:a="http://schemas.openxmlformats.org/drawingml/2006/main">
-              <a:graphicData uri="http://schemas.openxmlformats.org/drawingml/2006/picture">
-                <pic:pic xmlns:pic="http://schemas.openxmlformats.org/drawingml/2006/picture">
-                  <pic:nvPicPr>
-                    <pic:cNvPr id="971824174" name="Video 1" descr="Xem Như Tôi Từng Cưới Được Cô Ấy, Hôn Lễ Của Em - Nhạc Trẻ Ballad Việt 2026 Triệu View Hot TikTok">
-                      <a:hlinkClick r:id="rId8"/>
-                    </pic:cNvPr>
-                    <pic:cNvPicPr/>
-                  </pic:nvPicPr>
-                  <pic:blipFill>
-                    <a:blip r:embed="rId9">
-                      <a:extLst>
-                        <a:ext uri="{28A0092B-C50C-407E-A947-70E740481C1C}">
-                          <a14:useLocalDpi xmlns:a14="http://schemas.microsoft.com/office/drawing/2010/main" val="0"/>
-                        </a:ext>
-                        <a:ext uri="{C809E66F-F1BF-436E-b5F7-EEA9579F0CBA}">
-                          <wp15:webVideoPr xmlns:wp15="http://schemas.microsoft.com/office/word/2012/wordprocessingDrawing" embeddedHtml="&lt;iframe width=&quot;200&quot; height=&quot;113&quot; src=&quot;https://www.youtube.com/embed/RJ62JHEE6GA?list=PLMk-tyR9x-qD8C88ETB9AfybhBTPi-HvF&quot; frameborder=&quot;0&quot; allow=&quot;accelerometer; autoplay; clipboard-write; encrypted-media; gyroscope; picture-in-picture; web-share&quot; referrerpolicy=&quot;strict-origin-when-cross-origin&quot; allowfullscreen=&quot;&quot; sandbox=&quot;allow-scripts allow-same-origin allow-popups&quot;&gt;&lt;/iframe&gt;" h="113" w="200"/>
-                        </a:ext>
-                      </a:extLst>
-                    </a:blip>
-                    <a:stretch>
-                      <a:fillRect/>
-                    </a:stretch>
-                  </pic:blipFill>
-                  <pic:spPr>
-                    <a:xfrm>
-                      <a:off x="0" y="0"/>
-                      <a:ext cx="5886450" cy="3429000"/>
-                    </a:xfrm>
-                    <a:prstGeom prst="rect">
-                      <a:avLst/>
-                    </a:prstGeom>
-                  </pic:spPr>
-                </pic:pic>
-              </a:graphicData>
-            </a:graphic>
-          </wp:inline>
-        </w:drawing>
-      </w:r>
+      <w:pPr>
+        <w:rPr>
+          <w:lang w:val="pt-BR"/>
+        </w:rPr>
+      </w:pPr>
+    </w:p>
+    <w:p>
+      <w:pPr>
+        <w:rPr>
+          <w:lang w:val="pt-BR"/>
+        </w:rPr>
+      </w:pPr>
     </w:p>
     <w:sectPr>
       <w:pgSz w:w="12240" w:h="15840"/>
@@ -954,6 +912,7 @@
   <w:style w:type="character" w:default="1" w:styleId="DefaultParagraphFont">
     <w:name w:val="Default Paragraph Font"/>
     <w:uiPriority w:val="1"/>
+    <w:semiHidden/>
     <w:unhideWhenUsed/>
   </w:style>
   <w:style w:type="table" w:default="1" w:styleId="TableNormal">

</xml_diff>